<commit_message>
API, WEB e MOBILE | Criação PLN - Obtenção de alguns valores por ele
</commit_message>
<xml_diff>
--- a/DOCS/CDCP-Levantamento-Requisitos-Check.docx
+++ b/DOCS/CDCP-Levantamento-Requisitos-Check.docx
@@ -8129,6 +8129,13 @@
                 <w:lang w:val="pt-BR"/>
               </w:rPr>
             </w:pPr>
+            <w:r>
+              <w:rPr>
+                <w:rFonts w:ascii="Arial" w:hAnsi="Arial" w:cs="Arial"/>
+                <w:lang w:val="pt-BR"/>
+              </w:rPr>
+              <w:t>X</w:t>
+            </w:r>
           </w:p>
         </w:tc>
       </w:tr>
@@ -11763,6 +11770,13 @@
                 <w:lang w:val="pt-BR"/>
               </w:rPr>
             </w:pPr>
+            <w:r>
+              <w:rPr>
+                <w:rFonts w:ascii="Arial" w:hAnsi="Arial" w:cs="Arial"/>
+                <w:lang w:val="pt-BR"/>
+              </w:rPr>
+              <w:t>X</w:t>
+            </w:r>
           </w:p>
         </w:tc>
       </w:tr>
@@ -12237,6 +12251,13 @@
                 <w:lang w:val="pt-BR"/>
               </w:rPr>
             </w:pPr>
+            <w:r>
+              <w:rPr>
+                <w:rFonts w:ascii="Arial" w:hAnsi="Arial" w:cs="Arial"/>
+                <w:lang w:val="pt-BR"/>
+              </w:rPr>
+              <w:t>X</w:t>
+            </w:r>
           </w:p>
         </w:tc>
       </w:tr>
@@ -12447,6 +12468,13 @@
                 <w:lang w:val="pt-BR"/>
               </w:rPr>
             </w:pPr>
+            <w:r>
+              <w:rPr>
+                <w:rFonts w:ascii="Arial" w:hAnsi="Arial" w:cs="Arial"/>
+                <w:lang w:val="pt-BR"/>
+              </w:rPr>
+              <w:t>X</w:t>
+            </w:r>
           </w:p>
         </w:tc>
       </w:tr>
@@ -12532,6 +12560,13 @@
                 <w:lang w:val="pt-BR"/>
               </w:rPr>
             </w:pPr>
+            <w:r>
+              <w:rPr>
+                <w:rFonts w:ascii="Arial" w:hAnsi="Arial" w:cs="Arial"/>
+                <w:lang w:val="pt-BR"/>
+              </w:rPr>
+              <w:t>X</w:t>
+            </w:r>
           </w:p>
         </w:tc>
       </w:tr>
@@ -12617,6 +12652,13 @@
                 <w:lang w:val="pt-BR"/>
               </w:rPr>
             </w:pPr>
+            <w:r>
+              <w:rPr>
+                <w:rFonts w:ascii="Arial" w:hAnsi="Arial" w:cs="Arial"/>
+                <w:lang w:val="pt-BR"/>
+              </w:rPr>
+              <w:t>X</w:t>
+            </w:r>
           </w:p>
         </w:tc>
       </w:tr>
@@ -12702,6 +12744,13 @@
                 <w:lang w:val="pt-BR"/>
               </w:rPr>
             </w:pPr>
+            <w:r>
+              <w:rPr>
+                <w:rFonts w:ascii="Arial" w:hAnsi="Arial" w:cs="Arial"/>
+                <w:lang w:val="pt-BR"/>
+              </w:rPr>
+              <w:t>X</w:t>
+            </w:r>
           </w:p>
         </w:tc>
       </w:tr>
@@ -12787,6 +12836,13 @@
                 <w:lang w:val="pt-BR"/>
               </w:rPr>
             </w:pPr>
+            <w:r>
+              <w:rPr>
+                <w:rFonts w:ascii="Arial" w:hAnsi="Arial" w:cs="Arial"/>
+                <w:lang w:val="pt-BR"/>
+              </w:rPr>
+              <w:t>X</w:t>
+            </w:r>
           </w:p>
         </w:tc>
       </w:tr>
@@ -12872,6 +12928,13 @@
                 <w:lang w:val="pt-BR"/>
               </w:rPr>
             </w:pPr>
+            <w:r>
+              <w:rPr>
+                <w:rFonts w:ascii="Arial" w:hAnsi="Arial" w:cs="Arial"/>
+                <w:lang w:val="pt-BR"/>
+              </w:rPr>
+              <w:t>X</w:t>
+            </w:r>
           </w:p>
         </w:tc>
       </w:tr>
@@ -12957,6 +13020,13 @@
                 <w:lang w:val="pt-BR"/>
               </w:rPr>
             </w:pPr>
+            <w:r>
+              <w:rPr>
+                <w:rFonts w:ascii="Arial" w:hAnsi="Arial" w:cs="Arial"/>
+                <w:lang w:val="pt-BR"/>
+              </w:rPr>
+              <w:t>X</w:t>
+            </w:r>
           </w:p>
         </w:tc>
       </w:tr>
@@ -15829,6 +15899,13 @@
                 <w:lang w:val="pt-BR"/>
               </w:rPr>
             </w:pPr>
+            <w:r>
+              <w:rPr>
+                <w:rFonts w:ascii="Arial" w:hAnsi="Arial" w:cs="Arial"/>
+                <w:lang w:val="pt-BR"/>
+              </w:rPr>
+              <w:t>X</w:t>
+            </w:r>
           </w:p>
         </w:tc>
       </w:tr>
@@ -15914,6 +15991,13 @@
                 <w:lang w:val="pt-BR"/>
               </w:rPr>
             </w:pPr>
+            <w:r>
+              <w:rPr>
+                <w:rFonts w:ascii="Arial" w:hAnsi="Arial" w:cs="Arial"/>
+                <w:lang w:val="pt-BR"/>
+              </w:rPr>
+              <w:t>X</w:t>
+            </w:r>
           </w:p>
         </w:tc>
       </w:tr>
@@ -18538,6 +18622,13 @@
                 <w:lang w:val="pt-BR"/>
               </w:rPr>
             </w:pPr>
+            <w:r>
+              <w:rPr>
+                <w:rFonts w:ascii="Arial" w:hAnsi="Arial" w:cs="Arial"/>
+                <w:lang w:val="pt-BR"/>
+              </w:rPr>
+              <w:t>X</w:t>
+            </w:r>
           </w:p>
         </w:tc>
       </w:tr>
@@ -18836,6 +18927,13 @@
                 <w:lang w:val="pt-BR"/>
               </w:rPr>
             </w:pPr>
+            <w:r>
+              <w:rPr>
+                <w:rFonts w:ascii="Arial" w:hAnsi="Arial" w:cs="Arial"/>
+                <w:lang w:val="pt-BR"/>
+              </w:rPr>
+              <w:t>X</w:t>
+            </w:r>
           </w:p>
         </w:tc>
       </w:tr>
@@ -19437,6 +19535,13 @@
                 <w:lang w:val="pt-BR"/>
               </w:rPr>
             </w:pPr>
+            <w:r>
+              <w:rPr>
+                <w:rFonts w:ascii="Arial" w:hAnsi="Arial" w:cs="Arial"/>
+                <w:lang w:val="pt-BR"/>
+              </w:rPr>
+              <w:t>X</w:t>
+            </w:r>
           </w:p>
         </w:tc>
       </w:tr>
@@ -22005,6 +22110,13 @@
                 <w:lang w:val="pt-BR"/>
               </w:rPr>
             </w:pPr>
+            <w:r>
+              <w:rPr>
+                <w:rFonts w:ascii="Arial" w:hAnsi="Arial" w:cs="Arial"/>
+                <w:lang w:val="pt-BR"/>
+              </w:rPr>
+              <w:t>X</w:t>
+            </w:r>
           </w:p>
         </w:tc>
       </w:tr>
@@ -22084,6 +22196,13 @@
                 <w:lang w:val="pt-BR"/>
               </w:rPr>
             </w:pPr>
+            <w:r>
+              <w:rPr>
+                <w:rFonts w:ascii="Arial" w:hAnsi="Arial" w:cs="Arial"/>
+                <w:lang w:val="pt-BR"/>
+              </w:rPr>
+              <w:t>X</w:t>
+            </w:r>
           </w:p>
         </w:tc>
       </w:tr>
@@ -22163,6 +22282,13 @@
                 <w:lang w:val="pt-BR"/>
               </w:rPr>
             </w:pPr>
+            <w:r>
+              <w:rPr>
+                <w:rFonts w:ascii="Arial" w:hAnsi="Arial" w:cs="Arial"/>
+                <w:lang w:val="pt-BR"/>
+              </w:rPr>
+              <w:t>X</w:t>
+            </w:r>
           </w:p>
         </w:tc>
       </w:tr>
@@ -22242,6 +22368,13 @@
                 <w:lang w:val="pt-BR"/>
               </w:rPr>
             </w:pPr>
+            <w:r>
+              <w:rPr>
+                <w:rFonts w:ascii="Arial" w:hAnsi="Arial" w:cs="Arial"/>
+                <w:lang w:val="pt-BR"/>
+              </w:rPr>
+              <w:t>X</w:t>
+            </w:r>
           </w:p>
         </w:tc>
       </w:tr>
@@ -22321,6 +22454,13 @@
                 <w:lang w:val="pt-BR"/>
               </w:rPr>
             </w:pPr>
+            <w:r>
+              <w:rPr>
+                <w:rFonts w:ascii="Arial" w:hAnsi="Arial" w:cs="Arial"/>
+                <w:lang w:val="pt-BR"/>
+              </w:rPr>
+              <w:t>X</w:t>
+            </w:r>
           </w:p>
         </w:tc>
       </w:tr>
@@ -22401,6 +22541,13 @@
                 <w:lang w:val="pt-BR"/>
               </w:rPr>
             </w:pPr>
+            <w:r>
+              <w:rPr>
+                <w:rFonts w:ascii="Arial" w:hAnsi="Arial" w:cs="Arial"/>
+                <w:lang w:val="pt-BR"/>
+              </w:rPr>
+              <w:t>X</w:t>
+            </w:r>
           </w:p>
         </w:tc>
       </w:tr>
@@ -22479,6 +22626,13 @@
                 <w:lang w:val="pt-BR"/>
               </w:rPr>
             </w:pPr>
+            <w:r>
+              <w:rPr>
+                <w:rFonts w:ascii="Arial" w:hAnsi="Arial" w:cs="Arial"/>
+                <w:lang w:val="pt-BR"/>
+              </w:rPr>
+              <w:t>X</w:t>
+            </w:r>
           </w:p>
         </w:tc>
       </w:tr>
@@ -22558,6 +22712,13 @@
                 <w:lang w:val="pt-BR"/>
               </w:rPr>
             </w:pPr>
+            <w:r>
+              <w:rPr>
+                <w:rFonts w:ascii="Arial" w:hAnsi="Arial" w:cs="Arial"/>
+                <w:lang w:val="pt-BR"/>
+              </w:rPr>
+              <w:t>X</w:t>
+            </w:r>
           </w:p>
         </w:tc>
       </w:tr>
@@ -22637,6 +22798,13 @@
                 <w:lang w:val="pt-BR"/>
               </w:rPr>
             </w:pPr>
+            <w:r>
+              <w:rPr>
+                <w:rFonts w:ascii="Arial" w:hAnsi="Arial" w:cs="Arial"/>
+                <w:lang w:val="pt-BR"/>
+              </w:rPr>
+              <w:t>X</w:t>
+            </w:r>
           </w:p>
         </w:tc>
       </w:tr>
@@ -25698,6 +25866,13 @@
                 <w:lang w:val="pt-BR"/>
               </w:rPr>
             </w:pPr>
+            <w:r>
+              <w:rPr>
+                <w:rFonts w:ascii="Arial" w:hAnsi="Arial" w:cs="Arial"/>
+                <w:lang w:val="pt-BR"/>
+              </w:rPr>
+              <w:t>X</w:t>
+            </w:r>
           </w:p>
         </w:tc>
       </w:tr>
@@ -27162,6 +27337,13 @@
                 <w:lang w:val="pt-BR"/>
               </w:rPr>
             </w:pPr>
+            <w:r>
+              <w:rPr>
+                <w:rFonts w:ascii="Arial" w:hAnsi="Arial" w:cs="Arial"/>
+                <w:lang w:val="pt-BR"/>
+              </w:rPr>
+              <w:t>X</w:t>
+            </w:r>
           </w:p>
         </w:tc>
       </w:tr>
@@ -27247,6 +27429,13 @@
                 <w:lang w:val="pt-BR"/>
               </w:rPr>
             </w:pPr>
+            <w:r>
+              <w:rPr>
+                <w:rFonts w:ascii="Arial" w:hAnsi="Arial" w:cs="Arial"/>
+                <w:lang w:val="pt-BR"/>
+              </w:rPr>
+              <w:t>X</w:t>
+            </w:r>
           </w:p>
         </w:tc>
       </w:tr>
@@ -27424,6 +27613,13 @@
                 <w:lang w:val="pt-BR"/>
               </w:rPr>
             </w:pPr>
+            <w:r>
+              <w:rPr>
+                <w:rFonts w:ascii="Arial" w:hAnsi="Arial" w:cs="Arial"/>
+                <w:lang w:val="pt-BR"/>
+              </w:rPr>
+              <w:t>X</w:t>
+            </w:r>
           </w:p>
         </w:tc>
       </w:tr>

</xml_diff>

<commit_message>
Mineração | Finalizado e integrado método de agrupamento de chamados
</commit_message>
<xml_diff>
--- a/DOCS/CDCP-Levantamento-Requisitos-Check.docx
+++ b/DOCS/CDCP-Levantamento-Requisitos-Check.docx
@@ -3412,6 +3412,13 @@
                 <w:lang w:val="pt-BR"/>
               </w:rPr>
             </w:pPr>
+            <w:r>
+              <w:rPr>
+                <w:rFonts w:ascii="Arial" w:hAnsi="Arial" w:cs="Arial"/>
+                <w:lang w:val="pt-BR"/>
+              </w:rPr>
+              <w:t>X</w:t>
+            </w:r>
           </w:p>
         </w:tc>
       </w:tr>
@@ -3590,6 +3597,13 @@
                 <w:lang w:val="pt-BR"/>
               </w:rPr>
             </w:pPr>
+            <w:r>
+              <w:rPr>
+                <w:rFonts w:ascii="Arial" w:hAnsi="Arial" w:cs="Arial"/>
+                <w:lang w:val="pt-BR"/>
+              </w:rPr>
+              <w:t>X</w:t>
+            </w:r>
           </w:p>
         </w:tc>
       </w:tr>
@@ -3675,6 +3689,13 @@
                 <w:lang w:val="pt-BR"/>
               </w:rPr>
             </w:pPr>
+            <w:r>
+              <w:rPr>
+                <w:rFonts w:ascii="Arial" w:hAnsi="Arial" w:cs="Arial"/>
+                <w:lang w:val="pt-BR"/>
+              </w:rPr>
+              <w:t>X</w:t>
+            </w:r>
           </w:p>
         </w:tc>
       </w:tr>
@@ -3760,6 +3781,13 @@
                 <w:lang w:val="pt-BR"/>
               </w:rPr>
             </w:pPr>
+            <w:r>
+              <w:rPr>
+                <w:rFonts w:ascii="Arial" w:hAnsi="Arial" w:cs="Arial"/>
+                <w:lang w:val="pt-BR"/>
+              </w:rPr>
+              <w:t>X</w:t>
+            </w:r>
           </w:p>
         </w:tc>
       </w:tr>
@@ -3845,6 +3873,13 @@
                 <w:lang w:val="pt-BR"/>
               </w:rPr>
             </w:pPr>
+            <w:r>
+              <w:rPr>
+                <w:rFonts w:ascii="Arial" w:hAnsi="Arial" w:cs="Arial"/>
+                <w:lang w:val="pt-BR"/>
+              </w:rPr>
+              <w:t>X</w:t>
+            </w:r>
           </w:p>
         </w:tc>
       </w:tr>
@@ -3930,6 +3965,13 @@
                 <w:lang w:val="pt-BR"/>
               </w:rPr>
             </w:pPr>
+            <w:r>
+              <w:rPr>
+                <w:rFonts w:ascii="Arial" w:hAnsi="Arial" w:cs="Arial"/>
+                <w:lang w:val="pt-BR"/>
+              </w:rPr>
+              <w:t>X</w:t>
+            </w:r>
           </w:p>
         </w:tc>
       </w:tr>
@@ -4135,6 +4177,13 @@
                 <w:lang w:val="pt-BR"/>
               </w:rPr>
             </w:pPr>
+            <w:r>
+              <w:rPr>
+                <w:rFonts w:ascii="Arial" w:hAnsi="Arial" w:cs="Arial"/>
+                <w:lang w:val="pt-BR"/>
+              </w:rPr>
+              <w:t>X</w:t>
+            </w:r>
           </w:p>
         </w:tc>
       </w:tr>
@@ -4248,6 +4297,13 @@
                 <w:lang w:val="pt-BR"/>
               </w:rPr>
             </w:pPr>
+            <w:r>
+              <w:rPr>
+                <w:rFonts w:ascii="Arial" w:hAnsi="Arial" w:cs="Arial"/>
+                <w:lang w:val="pt-BR"/>
+              </w:rPr>
+              <w:t>X</w:t>
+            </w:r>
           </w:p>
         </w:tc>
       </w:tr>
@@ -4361,6 +4417,13 @@
                 <w:lang w:val="pt-BR"/>
               </w:rPr>
             </w:pPr>
+            <w:r>
+              <w:rPr>
+                <w:rFonts w:ascii="Arial" w:hAnsi="Arial" w:cs="Arial"/>
+                <w:lang w:val="pt-BR"/>
+              </w:rPr>
+              <w:t>X</w:t>
+            </w:r>
           </w:p>
         </w:tc>
       </w:tr>
@@ -4474,6 +4537,13 @@
                 <w:lang w:val="pt-BR"/>
               </w:rPr>
             </w:pPr>
+            <w:r>
+              <w:rPr>
+                <w:rFonts w:ascii="Arial" w:hAnsi="Arial" w:cs="Arial"/>
+                <w:lang w:val="pt-BR"/>
+              </w:rPr>
+              <w:t>X</w:t>
+            </w:r>
           </w:p>
         </w:tc>
       </w:tr>
@@ -4682,6 +4752,13 @@
                 <w:lang w:val="pt-BR"/>
               </w:rPr>
             </w:pPr>
+            <w:r>
+              <w:rPr>
+                <w:rFonts w:ascii="Arial" w:hAnsi="Arial" w:cs="Arial"/>
+                <w:lang w:val="pt-BR"/>
+              </w:rPr>
+              <w:t>X</w:t>
+            </w:r>
           </w:p>
         </w:tc>
       </w:tr>
@@ -19842,6 +19919,13 @@
                 <w:lang w:val="pt-BR"/>
               </w:rPr>
             </w:pPr>
+            <w:r>
+              <w:rPr>
+                <w:rFonts w:ascii="Arial" w:hAnsi="Arial" w:cs="Arial"/>
+                <w:lang w:val="pt-BR"/>
+              </w:rPr>
+              <w:t>X</w:t>
+            </w:r>
           </w:p>
         </w:tc>
       </w:tr>
@@ -19941,6 +20025,13 @@
                 <w:lang w:val="pt-BR"/>
               </w:rPr>
             </w:pPr>
+            <w:r>
+              <w:rPr>
+                <w:rFonts w:ascii="Arial" w:hAnsi="Arial" w:cs="Arial"/>
+                <w:lang w:val="pt-BR"/>
+              </w:rPr>
+              <w:t>X</w:t>
+            </w:r>
           </w:p>
         </w:tc>
       </w:tr>
@@ -20026,6 +20117,13 @@
                 <w:lang w:val="pt-BR"/>
               </w:rPr>
             </w:pPr>
+            <w:r>
+              <w:rPr>
+                <w:rFonts w:ascii="Arial" w:hAnsi="Arial" w:cs="Arial"/>
+                <w:lang w:val="pt-BR"/>
+              </w:rPr>
+              <w:t>X</w:t>
+            </w:r>
           </w:p>
         </w:tc>
       </w:tr>
@@ -20310,6 +20408,13 @@
                 <w:lang w:val="pt-BR"/>
               </w:rPr>
             </w:pPr>
+            <w:r>
+              <w:rPr>
+                <w:rFonts w:ascii="Arial" w:hAnsi="Arial" w:cs="Arial"/>
+                <w:lang w:val="pt-BR"/>
+              </w:rPr>
+              <w:t>X</w:t>
+            </w:r>
           </w:p>
         </w:tc>
       </w:tr>
@@ -20409,6 +20514,13 @@
                 <w:lang w:val="pt-BR"/>
               </w:rPr>
             </w:pPr>
+            <w:r>
+              <w:rPr>
+                <w:rFonts w:ascii="Arial" w:hAnsi="Arial" w:cs="Arial"/>
+                <w:lang w:val="pt-BR"/>
+              </w:rPr>
+              <w:t>X</w:t>
+            </w:r>
           </w:p>
         </w:tc>
       </w:tr>
@@ -20508,6 +20620,13 @@
                 <w:lang w:val="pt-BR"/>
               </w:rPr>
             </w:pPr>
+            <w:r>
+              <w:rPr>
+                <w:rFonts w:ascii="Arial" w:hAnsi="Arial" w:cs="Arial"/>
+                <w:lang w:val="pt-BR"/>
+              </w:rPr>
+              <w:t>X</w:t>
+            </w:r>
           </w:p>
         </w:tc>
       </w:tr>
@@ -20607,6 +20726,13 @@
                 <w:lang w:val="pt-BR"/>
               </w:rPr>
             </w:pPr>
+            <w:r>
+              <w:rPr>
+                <w:rFonts w:ascii="Arial" w:hAnsi="Arial" w:cs="Arial"/>
+                <w:lang w:val="pt-BR"/>
+              </w:rPr>
+              <w:t>X</w:t>
+            </w:r>
           </w:p>
         </w:tc>
       </w:tr>
@@ -21258,6 +21384,13 @@
                 <w:lang w:val="pt-BR"/>
               </w:rPr>
             </w:pPr>
+            <w:r>
+              <w:rPr>
+                <w:rFonts w:ascii="Arial" w:hAnsi="Arial" w:cs="Arial"/>
+                <w:lang w:val="pt-BR"/>
+              </w:rPr>
+              <w:t>X</w:t>
+            </w:r>
           </w:p>
         </w:tc>
       </w:tr>
@@ -21338,6 +21471,13 @@
                 <w:lang w:val="pt-BR"/>
               </w:rPr>
             </w:pPr>
+            <w:r>
+              <w:rPr>
+                <w:rFonts w:ascii="Arial" w:hAnsi="Arial" w:cs="Arial"/>
+                <w:lang w:val="pt-BR"/>
+              </w:rPr>
+              <w:t>X</w:t>
+            </w:r>
           </w:p>
         </w:tc>
       </w:tr>
@@ -24587,6 +24727,13 @@
                 <w:lang w:val="pt-BR"/>
               </w:rPr>
             </w:pPr>
+            <w:r>
+              <w:rPr>
+                <w:rFonts w:ascii="Arial" w:hAnsi="Arial" w:cs="Arial"/>
+                <w:lang w:val="pt-BR"/>
+              </w:rPr>
+              <w:t>X</w:t>
+            </w:r>
           </w:p>
         </w:tc>
       </w:tr>
@@ -26524,6 +26671,13 @@
                 <w:lang w:val="pt-BR"/>
               </w:rPr>
             </w:pPr>
+            <w:r>
+              <w:rPr>
+                <w:rFonts w:ascii="Arial" w:hAnsi="Arial" w:cs="Arial"/>
+                <w:lang w:val="pt-BR"/>
+              </w:rPr>
+              <w:t>X</w:t>
+            </w:r>
           </w:p>
         </w:tc>
       </w:tr>
@@ -26637,6 +26791,13 @@
                 <w:lang w:val="pt-BR"/>
               </w:rPr>
             </w:pPr>
+            <w:r>
+              <w:rPr>
+                <w:rFonts w:ascii="Arial" w:hAnsi="Arial" w:cs="Arial"/>
+                <w:lang w:val="pt-BR"/>
+              </w:rPr>
+              <w:t>X</w:t>
+            </w:r>
           </w:p>
         </w:tc>
       </w:tr>
@@ -26750,6 +26911,13 @@
                 <w:lang w:val="pt-BR"/>
               </w:rPr>
             </w:pPr>
+            <w:r>
+              <w:rPr>
+                <w:rFonts w:ascii="Arial" w:hAnsi="Arial" w:cs="Arial"/>
+                <w:lang w:val="pt-BR"/>
+              </w:rPr>
+              <w:t>X</w:t>
+            </w:r>
           </w:p>
         </w:tc>
       </w:tr>
@@ -26863,6 +27031,13 @@
                 <w:lang w:val="pt-BR"/>
               </w:rPr>
             </w:pPr>
+            <w:r>
+              <w:rPr>
+                <w:rFonts w:ascii="Arial" w:hAnsi="Arial" w:cs="Arial"/>
+                <w:lang w:val="pt-BR"/>
+              </w:rPr>
+              <w:t>X</w:t>
+            </w:r>
           </w:p>
         </w:tc>
       </w:tr>
@@ -26976,6 +27151,13 @@
                 <w:lang w:val="pt-BR"/>
               </w:rPr>
             </w:pPr>
+            <w:r>
+              <w:rPr>
+                <w:rFonts w:ascii="Arial" w:hAnsi="Arial" w:cs="Arial"/>
+                <w:lang w:val="pt-BR"/>
+              </w:rPr>
+              <w:t>X</w:t>
+            </w:r>
           </w:p>
         </w:tc>
       </w:tr>

</xml_diff>

<commit_message>
Documentação | Atualização documentação e README
</commit_message>
<xml_diff>
--- a/DOCS/CDCP-Levantamento-Requisitos-Check.docx
+++ b/DOCS/CDCP-Levantamento-Requisitos-Check.docx
@@ -1709,6 +1709,13 @@
                 <w:lang w:val="pt-BR"/>
               </w:rPr>
             </w:pPr>
+            <w:r>
+              <w:rPr>
+                <w:rFonts w:ascii="Arial" w:hAnsi="Arial" w:cs="Arial"/>
+                <w:lang w:val="pt-BR"/>
+              </w:rPr>
+              <w:t>X</w:t>
+            </w:r>
           </w:p>
         </w:tc>
       </w:tr>
@@ -21068,6 +21075,13 @@
                 <w:lang w:val="pt-BR"/>
               </w:rPr>
             </w:pPr>
+            <w:r>
+              <w:rPr>
+                <w:rFonts w:ascii="Arial" w:hAnsi="Arial" w:cs="Arial"/>
+                <w:lang w:val="pt-BR"/>
+              </w:rPr>
+              <w:t>X</w:t>
+            </w:r>
           </w:p>
         </w:tc>
       </w:tr>
@@ -21147,6 +21161,13 @@
                 <w:lang w:val="pt-BR"/>
               </w:rPr>
             </w:pPr>
+            <w:r>
+              <w:rPr>
+                <w:rFonts w:ascii="Arial" w:hAnsi="Arial" w:cs="Arial"/>
+                <w:lang w:val="pt-BR"/>
+              </w:rPr>
+              <w:t>X</w:t>
+            </w:r>
           </w:p>
         </w:tc>
       </w:tr>
@@ -21226,6 +21247,13 @@
                 <w:lang w:val="pt-BR"/>
               </w:rPr>
             </w:pPr>
+            <w:r>
+              <w:rPr>
+                <w:rFonts w:ascii="Arial" w:hAnsi="Arial" w:cs="Arial"/>
+                <w:lang w:val="pt-BR"/>
+              </w:rPr>
+              <w:t>X</w:t>
+            </w:r>
           </w:p>
         </w:tc>
       </w:tr>
@@ -21305,6 +21333,13 @@
                 <w:lang w:val="pt-BR"/>
               </w:rPr>
             </w:pPr>
+            <w:r>
+              <w:rPr>
+                <w:rFonts w:ascii="Arial" w:hAnsi="Arial" w:cs="Arial"/>
+                <w:lang w:val="pt-BR"/>
+              </w:rPr>
+              <w:t>X</w:t>
+            </w:r>
           </w:p>
         </w:tc>
       </w:tr>

</xml_diff>